<commit_message>
Removed: generated UAT Field Template
</commit_message>
<xml_diff>
--- a/UAT Field Template.docx
+++ b/UAT Field Template.docx
@@ -175,7 +175,7 @@
                 <w:sz w:val="28"/>
                 <w:szCs w:val="28"/>
               </w:rPr>
-              <w:t>Ministry of Defence</w:t>
+              <w:t>The organisation</w:t>
             </w:r>
           </w:p>
           <w:p>
@@ -255,30 +255,7 @@
                 <w:sz w:val="28"/>
                 <w:szCs w:val="28"/>
               </w:rPr>
-              <w:t>Paya Lebar Air Base (</w:t>
-            </w:r>
-            <w:proofErr w:type="spellStart"/>
-            <w:r>
-              <w:rPr>
-                <w:sz w:val="28"/>
-                <w:szCs w:val="28"/>
-              </w:rPr>
-              <w:t>Blk</w:t>
-            </w:r>
-            <w:proofErr w:type="spellEnd"/>
-            <w:r>
-              <w:rPr>
-                <w:sz w:val="28"/>
-                <w:szCs w:val="28"/>
-              </w:rPr>
-              <w:t xml:space="preserve"> 4</w:t>
-            </w:r>
-            <w:r>
-              <w:rPr>
-                <w:sz w:val="28"/>
-                <w:szCs w:val="28"/>
-              </w:rPr>
-              <w:t>)</w:t>
+              <w:t>The venue</w:t>
             </w:r>
           </w:p>
           <w:p>
@@ -365,7 +342,7 @@
                 <w:sz w:val="28"/>
                 <w:szCs w:val="28"/>
               </w:rPr>
-              <w:t>200 Airport Rd, Singapore 534257</w:t>
+              <w:t>The address</w:t>
             </w:r>
           </w:p>
           <w:p>
@@ -452,7 +429,7 @@
                 <w:sz w:val="28"/>
                 <w:szCs w:val="28"/>
               </w:rPr>
-              <w:t>534257</w:t>
+              <w:t>123456</w:t>
             </w:r>
           </w:p>
           <w:p>
@@ -525,7 +502,7 @@
                 <w:sz w:val="28"/>
                 <w:szCs w:val="28"/>
               </w:rPr>
-              <w:t>Military Camp</w:t>
+              <w:t>The category</w:t>
             </w:r>
           </w:p>
         </w:tc>
@@ -1305,7 +1282,7 @@
           <w:b/>
           <w:color w:val="auto"/>
         </w:rPr>
-        <w:t>1339</w:t>
+        <w:t>[Number]</w:t>
       </w:r>
     </w:p>
     <w:tbl>
@@ -2049,6 +2026,116 @@
     </w:p>
     <w:p>
       <w:pPr>
+        <w:rPr>
+          <w:rFonts w:eastAsiaTheme="majorEastAsia" w:cstheme="majorBidi"/>
+          <w:b/>
+          <w:sz w:val="28"/>
+          <w:szCs w:val="28"/>
+        </w:rPr>
+      </w:pPr>
+    </w:p>
+    <w:p>
+      <w:pPr>
+        <w:rPr>
+          <w:rFonts w:eastAsiaTheme="majorEastAsia" w:cstheme="majorBidi"/>
+          <w:b/>
+          <w:sz w:val="28"/>
+          <w:szCs w:val="28"/>
+        </w:rPr>
+      </w:pPr>
+    </w:p>
+    <w:p>
+      <w:pPr>
+        <w:rPr>
+          <w:rFonts w:eastAsiaTheme="majorEastAsia" w:cstheme="majorBidi"/>
+          <w:b/>
+          <w:sz w:val="28"/>
+          <w:szCs w:val="28"/>
+        </w:rPr>
+      </w:pPr>
+    </w:p>
+    <w:p>
+      <w:pPr>
+        <w:rPr>
+          <w:rFonts w:eastAsiaTheme="majorEastAsia" w:cstheme="majorBidi"/>
+          <w:b/>
+          <w:sz w:val="28"/>
+          <w:szCs w:val="28"/>
+        </w:rPr>
+      </w:pPr>
+    </w:p>
+    <w:p>
+      <w:pPr>
+        <w:rPr>
+          <w:rFonts w:eastAsiaTheme="majorEastAsia" w:cstheme="majorBidi"/>
+          <w:b/>
+          <w:sz w:val="28"/>
+          <w:szCs w:val="28"/>
+        </w:rPr>
+      </w:pPr>
+    </w:p>
+    <w:p>
+      <w:pPr>
+        <w:rPr>
+          <w:rFonts w:eastAsiaTheme="majorEastAsia" w:cstheme="majorBidi"/>
+          <w:b/>
+          <w:sz w:val="28"/>
+          <w:szCs w:val="28"/>
+        </w:rPr>
+      </w:pPr>
+    </w:p>
+    <w:p>
+      <w:pPr>
+        <w:rPr>
+          <w:rFonts w:eastAsiaTheme="majorEastAsia" w:cstheme="majorBidi"/>
+          <w:b/>
+          <w:sz w:val="28"/>
+          <w:szCs w:val="28"/>
+        </w:rPr>
+      </w:pPr>
+    </w:p>
+    <w:p>
+      <w:pPr>
+        <w:rPr>
+          <w:rFonts w:eastAsiaTheme="majorEastAsia" w:cstheme="majorBidi"/>
+          <w:b/>
+          <w:sz w:val="28"/>
+          <w:szCs w:val="28"/>
+        </w:rPr>
+      </w:pPr>
+    </w:p>
+    <w:p>
+      <w:pPr>
+        <w:rPr>
+          <w:rFonts w:eastAsiaTheme="majorEastAsia" w:cstheme="majorBidi"/>
+          <w:b/>
+          <w:sz w:val="28"/>
+          <w:szCs w:val="28"/>
+        </w:rPr>
+      </w:pPr>
+    </w:p>
+    <w:p>
+      <w:pPr>
+        <w:rPr>
+          <w:rFonts w:eastAsiaTheme="majorEastAsia" w:cstheme="majorBidi"/>
+          <w:b/>
+          <w:sz w:val="28"/>
+          <w:szCs w:val="28"/>
+        </w:rPr>
+      </w:pPr>
+    </w:p>
+    <w:p>
+      <w:pPr>
+        <w:rPr>
+          <w:rFonts w:eastAsiaTheme="majorEastAsia" w:cstheme="majorBidi"/>
+          <w:b/>
+          <w:sz w:val="28"/>
+          <w:szCs w:val="28"/>
+        </w:rPr>
+      </w:pPr>
+    </w:p>
+    <w:p>
+      <w:pPr>
         <w:pStyle w:val="Heading1"/>
         <w:numPr>
           <w:ilvl w:val="0"/>
@@ -2071,6 +2158,7 @@
           <w:b/>
           <w:color w:val="auto"/>
         </w:rPr>
+        <w:lastRenderedPageBreak/>
         <w:t>OVERALL TEST RESULT AND SIGNOFF</w:t>
       </w:r>
       <w:bookmarkEnd w:id="8"/>
@@ -2428,7 +2516,6 @@
                 <w:sz w:val="24"/>
                 <w:szCs w:val="24"/>
               </w:rPr>
-              <w:lastRenderedPageBreak/>
               <w:t xml:space="preserve">Designation: </w:t>
             </w:r>
           </w:p>
@@ -2598,7 +2685,6 @@
                 <w:sz w:val="24"/>
                 <w:szCs w:val="24"/>
               </w:rPr>
-              <w:lastRenderedPageBreak/>
               <w:t xml:space="preserve">Designation: </w:t>
             </w:r>
           </w:p>
@@ -2649,7 +2735,6 @@
                 <w:sz w:val="24"/>
                 <w:szCs w:val="24"/>
               </w:rPr>
-              <w:lastRenderedPageBreak/>
               <w:t>Please affix organisation’s stamp.</w:t>
             </w:r>
           </w:p>
@@ -3139,6 +3224,7 @@
         <w:rPr>
           <w:rFonts w:cstheme="minorHAnsi"/>
         </w:rPr>
+        <w:lastRenderedPageBreak/>
         <w:t>Customer Acknowledgement</w:t>
       </w:r>
       <w:bookmarkEnd w:id="10"/>
@@ -3674,7 +3760,6 @@
                 <w:sz w:val="24"/>
                 <w:szCs w:val="24"/>
               </w:rPr>
-              <w:lastRenderedPageBreak/>
               <w:t>Name:</w:t>
             </w:r>
           </w:p>
@@ -4585,23 +4670,7 @@
               <w:sz w:val="20"/>
               <w:szCs w:val="20"/>
             </w:rPr>
-            <w:t>Paya Lebar Air Base (</w:t>
-          </w:r>
-          <w:proofErr w:type="spellStart"/>
-          <w:r>
-            <w:rPr>
-              <w:sz w:val="20"/>
-              <w:szCs w:val="20"/>
-            </w:rPr>
-            <w:t>Blk</w:t>
-          </w:r>
-          <w:proofErr w:type="spellEnd"/>
-          <w:r>
-            <w:rPr>
-              <w:sz w:val="20"/>
-              <w:szCs w:val="20"/>
-            </w:rPr>
-            <w:t xml:space="preserve"> 4)</w:t>
+            <w:t>The Venue</w:t>
           </w:r>
         </w:p>
       </w:tc>
@@ -4647,7 +4716,7 @@
               <w:sz w:val="20"/>
               <w:szCs w:val="20"/>
             </w:rPr>
-            <w:t>200 Airport Rd, Singapore 534257</w:t>
+            <w:t>The Address</w:t>
           </w:r>
         </w:p>
       </w:tc>
@@ -9487,21 +9556,10 @@
 </file>
 
 <file path=customXml/item1.xml><?xml version="1.0" encoding="utf-8"?>
-<p:properties xmlns:p="http://schemas.microsoft.com/office/2006/metadata/properties" xmlns:xsi="http://www.w3.org/2001/XMLSchema-instance" xmlns:pc="http://schemas.microsoft.com/office/infopath/2007/PartnerControls">
-  <documentManagement/>
-</p:properties>
+<b:Sources xmlns:b="http://schemas.openxmlformats.org/officeDocument/2006/bibliography" xmlns="http://schemas.openxmlformats.org/officeDocument/2006/bibliography" SelectedStyle="\APASixthEditionOfficeOnline.xsl" StyleName="APA" Version="6"/>
 </file>
 
 <file path=customXml/item2.xml><?xml version="1.0" encoding="utf-8"?>
-<?mso-contentType ?>
-<FormTemplates xmlns="http://schemas.microsoft.com/sharepoint/v3/contenttype/forms">
-  <Display>DocumentLibraryForm</Display>
-  <Edit>DocumentLibraryForm</Edit>
-  <New>DocumentLibraryForm</New>
-</FormTemplates>
-</file>
-
-<file path=customXml/item3.xml><?xml version="1.0" encoding="utf-8"?>
 <ct:contentTypeSchema xmlns:ct="http://schemas.microsoft.com/office/2006/metadata/contentType" xmlns:ma="http://schemas.microsoft.com/office/2006/metadata/properties/metaAttributes" ct:_="" ma:_="" ma:contentTypeName="Document" ma:contentTypeID="0x010100200FE1F2D1D77B46A026833BA299ABFF" ma:contentTypeVersion="0" ma:contentTypeDescription="Create a new document." ma:contentTypeScope="" ma:versionID="d43880b1288e4265d5f834db3726eea8">
   <xsd:schema xmlns:xsd="http://www.w3.org/2001/XMLSchema" xmlns:xs="http://www.w3.org/2001/XMLSchema" xmlns:p="http://schemas.microsoft.com/office/2006/metadata/properties" targetNamespace="http://schemas.microsoft.com/office/2006/metadata/properties" ma:root="true" ma:fieldsID="66a9e0779a85d62bb2248c31b91edb77">
     <xsd:element name="properties">
@@ -9615,28 +9673,30 @@
 </ct:contentTypeSchema>
 </file>
 
+<file path=customXml/item3.xml><?xml version="1.0" encoding="utf-8"?>
+<?mso-contentType ?>
+<FormTemplates xmlns="http://schemas.microsoft.com/sharepoint/v3/contenttype/forms">
+  <Display>DocumentLibraryForm</Display>
+  <Edit>DocumentLibraryForm</Edit>
+  <New>DocumentLibraryForm</New>
+</FormTemplates>
+</file>
+
 <file path=customXml/item4.xml><?xml version="1.0" encoding="utf-8"?>
-<b:Sources xmlns:b="http://schemas.openxmlformats.org/officeDocument/2006/bibliography" xmlns="http://schemas.openxmlformats.org/officeDocument/2006/bibliography" SelectedStyle="\APASixthEditionOfficeOnline.xsl" StyleName="APA" Version="6"/>
+<p:properties xmlns:p="http://schemas.microsoft.com/office/2006/metadata/properties" xmlns:xsi="http://www.w3.org/2001/XMLSchema-instance" xmlns:pc="http://schemas.microsoft.com/office/infopath/2007/PartnerControls">
+  <documentManagement/>
+</p:properties>
 </file>
 
 <file path=customXml/itemProps1.xml><?xml version="1.0" encoding="utf-8"?>
-<ds:datastoreItem xmlns:ds="http://schemas.openxmlformats.org/officeDocument/2006/customXml" ds:itemID="{0BEB0561-65F7-4F3D-843B-7668B6D5FA42}">
+<ds:datastoreItem xmlns:ds="http://schemas.openxmlformats.org/officeDocument/2006/customXml" ds:itemID="{C555CBDC-C244-4751-9813-8F37ADCBB4C8}">
   <ds:schemaRefs>
-    <ds:schemaRef ds:uri="http://schemas.microsoft.com/office/2006/metadata/properties"/>
-    <ds:schemaRef ds:uri="http://schemas.microsoft.com/office/infopath/2007/PartnerControls"/>
+    <ds:schemaRef ds:uri="http://schemas.openxmlformats.org/officeDocument/2006/bibliography"/>
   </ds:schemaRefs>
 </ds:datastoreItem>
 </file>
 
 <file path=customXml/itemProps2.xml><?xml version="1.0" encoding="utf-8"?>
-<ds:datastoreItem xmlns:ds="http://schemas.openxmlformats.org/officeDocument/2006/customXml" ds:itemID="{166C7A64-430E-4AFA-8FB7-A3408587B769}">
-  <ds:schemaRefs>
-    <ds:schemaRef ds:uri="http://schemas.microsoft.com/sharepoint/v3/contenttype/forms"/>
-  </ds:schemaRefs>
-</ds:datastoreItem>
-</file>
-
-<file path=customXml/itemProps3.xml><?xml version="1.0" encoding="utf-8"?>
 <ds:datastoreItem xmlns:ds="http://schemas.openxmlformats.org/officeDocument/2006/customXml" ds:itemID="{8535315D-E582-45C0-8BA3-5160EDCFF7DA}">
   <ds:schemaRefs>
     <ds:schemaRef ds:uri="http://schemas.microsoft.com/office/2006/metadata/contentType"/>
@@ -9652,10 +9712,19 @@
 </ds:datastoreItem>
 </file>
 
+<file path=customXml/itemProps3.xml><?xml version="1.0" encoding="utf-8"?>
+<ds:datastoreItem xmlns:ds="http://schemas.openxmlformats.org/officeDocument/2006/customXml" ds:itemID="{166C7A64-430E-4AFA-8FB7-A3408587B769}">
+  <ds:schemaRefs>
+    <ds:schemaRef ds:uri="http://schemas.microsoft.com/sharepoint/v3/contenttype/forms"/>
+  </ds:schemaRefs>
+</ds:datastoreItem>
+</file>
+
 <file path=customXml/itemProps4.xml><?xml version="1.0" encoding="utf-8"?>
-<ds:datastoreItem xmlns:ds="http://schemas.openxmlformats.org/officeDocument/2006/customXml" ds:itemID="{C555CBDC-C244-4751-9813-8F37ADCBB4C8}">
+<ds:datastoreItem xmlns:ds="http://schemas.openxmlformats.org/officeDocument/2006/customXml" ds:itemID="{0BEB0561-65F7-4F3D-843B-7668B6D5FA42}">
   <ds:schemaRefs>
-    <ds:schemaRef ds:uri="http://schemas.openxmlformats.org/officeDocument/2006/bibliography"/>
+    <ds:schemaRef ds:uri="http://schemas.microsoft.com/office/2006/metadata/properties"/>
+    <ds:schemaRef ds:uri="http://schemas.microsoft.com/office/infopath/2007/PartnerControls"/>
   </ds:schemaRefs>
 </ds:datastoreItem>
 </file>
</xml_diff>